<commit_message>
Case Assistant answered by a local Ollama model (row 188, round 1 of 2)
ASSISTANT_MODE=ollama beside off, preview and sourcetrace; the Ollama HTTP client and FakeOllama transport live only in backend/aslms/integration/ollama/.
Court information is read in every scope; one case's internal records only after the officer switches them on in that case's Assistant tab (one-way, audited, never drafts).
Citation checks, the portal's local-model state and the Include This Case's Internal Records switch, Compose extra_hosts and the optional ollama profile, runbook section 20.
Migration 0032 (the ollama mode and the one-way switch). Backend 2619 passed, 3 skipped; ruff clean; compose build and portal smoke pass.
CLAUDE.md rules and the software documentation updated on the owner's decisions of 27 Oct 2026.

Co-Authored-By: Claude Fable 5.1 <noreply@anthropic.com>
</commit_message>
<xml_diff>
--- a/docs/ASLMS_Software_Documentation.docx
+++ b/docs/ASLMS_Software_Documentation.docx
@@ -3367,7 +3367,7 @@
                 <w:sz w:val="20"/>
                 <w:szCs w:val="20"/>
               </w:rPr>
-              <w:t xml:space="preserve">Questions answered from court orders with every source cited by page. Prepared for the in-house SourceTrace service, with an approved local model on Government machines in the meantime.</w:t>
+              <w:t xml:space="preserve">Questions answered from court records with every source cited. Prepared for the in-house SourceTrace service; until it is connected, answers may be written by a local model on Government servers, never a cloud service.</w:t>
             </w:r>
           </w:p>
         </w:tc>
@@ -6160,7 +6160,7 @@
                 <w:sz w:val="20"/>
                 <w:szCs w:val="20"/>
               </w:rPr>
-              <w:t xml:space="preserve">No cloud AI</w:t>
+              <w:t xml:space="preserve">No cloud AI. AI only through SourceTrace or, until it is available, a local model on Government servers</w:t>
             </w:r>
           </w:p>
         </w:tc>
@@ -6194,7 +6194,7 @@
                 <w:sz w:val="20"/>
                 <w:szCs w:val="20"/>
               </w:rPr>
-              <w:t xml:space="preserve">AI goes through SourceTrace or, as approved on 27 October 2026, a local model on Government machines (section 6.4). No cloud AI service is ever used, and no AI runtime may be installed inside the ASLMS server software. Only court orders and court filings may ever go to SourceTrace, never notes or internal documents.</w:t>
+              <w:t xml:space="preserve">No cloud AI service or cloud model, and no AI runtime inside ASLMS itself; the system refuses to start if one is found or a cloud model is configured. Only court orders and court filings may ever go to SourceTrace, never notes or internal documents. The local model reads one case’s internal records only after the officer switches them on in that case’s Assistant tab.</w:t>
             </w:r>
           </w:p>
         </w:tc>
@@ -6690,7 +6690,7 @@
                 <w:sz w:val="20"/>
                 <w:szCs w:val="20"/>
               </w:rPr>
-              <w:t xml:space="preserve">Local model service (Ollama, on Government machines)</w:t>
+              <w:t xml:space="preserve">Local model (Ollama)</w:t>
             </w:r>
           </w:p>
         </w:tc>
@@ -6722,7 +6722,7 @@
                 <w:sz w:val="20"/>
                 <w:szCs w:val="20"/>
               </w:rPr>
-              <w:t xml:space="preserve">Case Assistant answers until SourceTrace is connected (section 6.4)</w:t>
+              <w:t xml:space="preserve">Case Assistant answers written by a local AI model on the ASLMS host or a Government server, until SourceTrace is connected</w:t>
             </w:r>
           </w:p>
         </w:tc>
@@ -6754,7 +6754,7 @@
                 <w:sz w:val="20"/>
                 <w:szCs w:val="20"/>
               </w:rPr>
-              <w:t xml:space="preserve">Approved; being built. ASLMS calls it on a private address</w:t>
+              <w:t xml:space="preserve">Built; switched on by a setting, never a cloud model</w:t>
             </w:r>
           </w:p>
         </w:tc>
@@ -12599,7 +12599,7 @@
         <w:rPr>
           <w:rFonts w:ascii="Calibri" w:cs="Calibri" w:eastAsia="Calibri" w:hAnsi="Calibri"/>
         </w:rPr>
-        <w:t xml:space="preserve">AI in ASLMS goes through SourceTrace, the Government’s in-house retrieval-augmented generation service, through a defined connector interface. Until SourceTrace is connected, a local model running on Government machines may answer the Case Assistant instead, as approved on 27 October 2026 (section 6.4). No cloud AI service is ever used, and the system refuses to start if an AI runtime is found among its own installed software.</w:t>
+        <w:t xml:space="preserve">All AI in ASLMS goes through the Case Assistant’s connector interface. SourceTrace, the Government’s in-house retrieval-augmented generation service, is the intended AI. Until it is available, the owner has allowed (27 October 2026) one alternative for Case Assistant questions only: a local AI model served by Ollama on the ASLMS host or a server the Government controls, reached over the network. No cloud AI service or cloud model is used, no AI runtime runs inside ASLMS itself, and the system refuses to start if one is found or a cloud model is configured.</w:t>
       </w:r>
     </w:p>
     <w:p>
@@ -12923,13 +12923,24 @@
     </w:p>
     <w:p>
       <w:pPr>
-        <w:pStyle w:val="Heading2"/>
+        <w:spacing w:after="120" w:before="0" w:line="276"/>
       </w:pPr>
       <w:r>
         <w:rPr>
           <w:rFonts w:ascii="Calibri" w:cs="Calibri" w:eastAsia="Calibri" w:hAnsi="Calibri"/>
         </w:rPr>
-        <w:t xml:space="preserve">6.2 Current status: preview mode</w:t>
+        <w:t xml:space="preserve">The local model follows its own, narrower rule. By default, in every scope, it reads court information only: court orders, the court filings the officer may open, and the case details and hearings. On a case’s Assistant tab, and only there, the officer may press “Include This Case’s Internal Records”; from then on, in that conversation only, the model also reads that case’s saved notes, file movement with remarks, pending actions and department documents that the officer may open on the case page. Drafts are never read, another case’s records are never read, the switch is recorded in the audit log, and it cannot be switched off within the conversation.</w:t>
+      </w:r>
+    </w:p>
+    <w:p>
+      <w:pPr>
+        <w:pStyle w:val="Heading2"/>
+      </w:pPr>
+      <w:r>
+        <w:rPr>
+          <w:rFonts w:ascii="Calibri" w:cs="Calibri" w:eastAsia="Calibri" w:hAnsi="Calibri"/>
+        </w:rPr>
+        <w:t xml:space="preserve">6.2 Current status: preview mode and the local model</w:t>
       </w:r>
     </w:p>
     <w:p>
@@ -12940,7 +12951,18 @@
         <w:rPr>
           <w:rFonts w:ascii="Calibri" w:cs="Calibri" w:eastAsia="Calibri" w:hAnsi="Calibri"/>
         </w:rPr>
-        <w:t xml:space="preserve">The Case Assistant screens, conversations, scopes, citations and privacy rules are built. The SourceTrace API documentation is awaited, so the connector to the real service is not yet built. Until then, in development and test only, a preview mode answers by full-text search over the stored court text on the ASLMS server and shows the matching passages with the line “Preview: passages found in the court records, not an AI answer.” Nothing leaves the server. Preview mode is refused in production.</w:t>
+        <w:t xml:space="preserve">The Case Assistant screens, conversations, scopes, citations and privacy rules are built. The SourceTrace API documentation is awaited, so the connector to the real service is not yet built. In development and test, a preview mode answers by full-text search over the stored court text on the ASLMS server and shows the matching passages with the line “Preview: passages found in the court records, not an AI answer.” Nothing leaves the server. Preview mode is refused in production.</w:t>
+      </w:r>
+    </w:p>
+    <w:p>
+      <w:pPr>
+        <w:spacing w:after="120" w:before="0" w:line="276"/>
+      </w:pPr>
+      <w:r>
+        <w:rPr>
+          <w:rFonts w:ascii="Calibri" w:cs="Calibri" w:eastAsia="Calibri" w:hAnsi="Calibri"/>
+        </w:rPr>
+        <w:t xml:space="preserve">The local-model mode is built and allowed in production as the fallback until SourceTrace is connected. ASLMS finds the passages and records itself and gives them to the model as numbered sources; the model only writes the answer. Every sentence must cite its source; the server removes references to sources that were not given, and an answer with no valid reference is replaced by a fixed line. Each answer shows which sources were court records and which were internal, and the text that was given to the model.</w:t>
       </w:r>
     </w:p>
     <w:p>
@@ -13000,6 +13022,22 @@
           <w:rFonts w:ascii="Calibri" w:cs="Calibri" w:eastAsia="Calibri" w:hAnsi="Calibri"/>
         </w:rPr>
         <w:t xml:space="preserve">Conversations are private to the person who held them; no administrator or auditor can read them.</w:t>
+      </w:r>
+    </w:p>
+    <w:p>
+      <w:pPr>
+        <w:pStyle w:val="ListParagraph"/>
+        <w:numPr>
+          <w:ilvl w:val="0"/>
+          <w:numId w:val="2"/>
+        </w:numPr>
+        <w:spacing w:after="60" w:line="276"/>
+      </w:pPr>
+      <w:r>
+        <w:rPr>
+          <w:rFonts w:ascii="Calibri" w:cs="Calibri" w:eastAsia="Calibri" w:hAnsi="Calibri"/>
+        </w:rPr>
+        <w:t xml:space="preserve">An answer that drew on an internal record the person can no longer open is hidden when read again.</w:t>
       </w:r>
     </w:p>
     <w:p>
@@ -15029,7 +15067,7 @@
                 <w:sz w:val="20"/>
                 <w:szCs w:val="20"/>
               </w:rPr>
-              <w:t xml:space="preserve">AI (when connected)</w:t>
+              <w:t xml:space="preserve">AI</w:t>
             </w:r>
           </w:p>
         </w:tc>
@@ -15063,7 +15101,7 @@
                 <w:sz w:val="20"/>
                 <w:szCs w:val="20"/>
               </w:rPr>
-              <w:t xml:space="preserve">SourceTrace, through its API</w:t>
+              <w:t xml:space="preserve">SourceTrace through its API when connected; until then, optionally, a local model (Ollama) on the ASLMS host or a Government server</w:t>
             </w:r>
           </w:p>
         </w:tc>
@@ -18117,7 +18155,7 @@
         <w:rPr>
           <w:rFonts w:ascii="Calibri" w:cs="Calibri" w:eastAsia="Calibri" w:hAnsi="Calibri"/>
         </w:rPr>
-        <w:t xml:space="preserve">No case data is sent to any cloud AI service; only court orders and court filings may go to the in-house SourceTrace service (section 6).</w:t>
+        <w:t xml:space="preserve">No case data is sent to any cloud AI service; only court orders and court filings may go to the in-house SourceTrace service, and the local model on Government servers reads one case’s internal records only after the officer switches them on (section 6).</w:t>
       </w:r>
     </w:p>
     <w:p>
@@ -21086,7 +21124,7 @@
                 <w:sz w:val="20"/>
                 <w:szCs w:val="20"/>
               </w:rPr>
-              <w:t xml:space="preserve">Screens and rules built; preview mode until SourceTrace or the local model is connected</w:t>
+              <w:t xml:space="preserve">Screens and rules built; preview mode until SourceTrace is connected</w:t>
             </w:r>
           </w:p>
         </w:tc>
@@ -21155,7 +21193,7 @@
                 <w:sz w:val="20"/>
                 <w:szCs w:val="20"/>
               </w:rPr>
-              <w:t xml:space="preserve">All AI through SourceTrace; no local model</w:t>
+              <w:t xml:space="preserve">All AI through SourceTrace</w:t>
             </w:r>
           </w:p>
         </w:tc>
@@ -21187,7 +21225,7 @@
                 <w:sz w:val="20"/>
                 <w:szCs w:val="20"/>
               </w:rPr>
-              <w:t xml:space="preserve">A local model on Government machines answers the Case Assistant until SourceTrace is connected, allowed in production; internal records of a case only when the officer switches them on for that case (approved 27 October 2026, being built)</w:t>
+              <w:t xml:space="preserve">Case Assistant answers written by a local model (Ollama) on Government servers until SourceTrace is connected; no cloud AI</w:t>
             </w:r>
           </w:p>
         </w:tc>
@@ -21219,7 +21257,108 @@
                 <w:sz w:val="20"/>
                 <w:szCs w:val="20"/>
               </w:rPr>
-              <w:t xml:space="preserve">SourceTrace not yet available; no court or internal text leaves Government machines</w:t>
+              <w:t xml:space="preserve">SourceTrace not yet available; owner’s decision of 27 Oct 2026</w:t>
+            </w:r>
+          </w:p>
+        </w:tc>
+      </w:tr>
+      <w:tr>
+        <w:trPr>
+          <w:cantSplit/>
+        </w:trPr>
+        <w:tc>
+          <w:tcPr>
+            <w:tcW w:type="dxa" w:w="2800"/>
+            <w:tcBorders>
+              <w:top w:val="single" w:color="C9D3DD" w:sz="4"/>
+              <w:left w:val="single" w:color="C9D3DD" w:sz="4"/>
+              <w:bottom w:val="single" w:color="C9D3DD" w:sz="4"/>
+              <w:right w:val="single" w:color="C9D3DD" w:sz="4"/>
+            </w:tcBorders>
+            <w:shd w:fill="FFFFFF" w:color="auto" w:val="clear"/>
+            <w:tcMar>
+              <w:top w:type="dxa" w:w="80"/>
+              <w:left w:type="dxa" w:w="120"/>
+              <w:bottom w:type="dxa" w:w="80"/>
+              <w:right w:type="dxa" w:w="120"/>
+            </w:tcMar>
+            <w:vAlign w:val="top"/>
+          </w:tcPr>
+          <w:p>
+            <w:pPr>
+              <w:spacing w:after="40"/>
+            </w:pPr>
+            <w:r>
+              <w:rPr>
+                <w:rFonts w:ascii="Calibri" w:cs="Calibri" w:eastAsia="Calibri" w:hAnsi="Calibri"/>
+                <w:sz w:val="20"/>
+                <w:szCs w:val="20"/>
+              </w:rPr>
+              <w:t xml:space="preserve">Notes and internal documents never sent to the AI</w:t>
+            </w:r>
+          </w:p>
+        </w:tc>
+        <w:tc>
+          <w:tcPr>
+            <w:tcW w:type="dxa" w:w="3638"/>
+            <w:tcBorders>
+              <w:top w:val="single" w:color="C9D3DD" w:sz="4"/>
+              <w:left w:val="single" w:color="C9D3DD" w:sz="4"/>
+              <w:bottom w:val="single" w:color="C9D3DD" w:sz="4"/>
+              <w:right w:val="single" w:color="C9D3DD" w:sz="4"/>
+            </w:tcBorders>
+            <w:shd w:fill="FFFFFF" w:color="auto" w:val="clear"/>
+            <w:tcMar>
+              <w:top w:type="dxa" w:w="80"/>
+              <w:left w:type="dxa" w:w="120"/>
+              <w:bottom w:type="dxa" w:w="80"/>
+              <w:right w:type="dxa" w:w="120"/>
+            </w:tcMar>
+            <w:vAlign w:val="top"/>
+          </w:tcPr>
+          <w:p>
+            <w:pPr>
+              <w:spacing w:after="40"/>
+            </w:pPr>
+            <w:r>
+              <w:rPr>
+                <w:rFonts w:ascii="Calibri" w:cs="Calibri" w:eastAsia="Calibri" w:hAnsi="Calibri"/>
+                <w:sz w:val="20"/>
+                <w:szCs w:val="20"/>
+              </w:rPr>
+              <w:t xml:space="preserve">Unchanged for SourceTrace. By default the local model reads court information only; it reads one case’s internal records (never drafts) only after the officer presses Include This Case’s Internal Records in that case’s Assistant tab (recorded in the audit log), and only what the officer may open</w:t>
+            </w:r>
+          </w:p>
+        </w:tc>
+        <w:tc>
+          <w:tcPr>
+            <w:tcW w:type="dxa" w:w="3200"/>
+            <w:tcBorders>
+              <w:top w:val="single" w:color="C9D3DD" w:sz="4"/>
+              <w:left w:val="single" w:color="C9D3DD" w:sz="4"/>
+              <w:bottom w:val="single" w:color="C9D3DD" w:sz="4"/>
+              <w:right w:val="single" w:color="C9D3DD" w:sz="4"/>
+            </w:tcBorders>
+            <w:shd w:fill="FFFFFF" w:color="auto" w:val="clear"/>
+            <w:tcMar>
+              <w:top w:type="dxa" w:w="80"/>
+              <w:left w:type="dxa" w:w="120"/>
+              <w:bottom w:type="dxa" w:w="80"/>
+              <w:right w:type="dxa" w:w="120"/>
+            </w:tcMar>
+            <w:vAlign w:val="top"/>
+          </w:tcPr>
+          <w:p>
+            <w:pPr>
+              <w:spacing w:after="40"/>
+            </w:pPr>
+            <w:r>
+              <w:rPr>
+                <w:rFonts w:ascii="Calibri" w:cs="Calibri" w:eastAsia="Calibri" w:hAnsi="Calibri"/>
+                <w:sz w:val="20"/>
+                <w:szCs w:val="20"/>
+              </w:rPr>
+              <w:t xml:space="preserve">Owner’s decision of 27 Oct 2026: officers work on their own case’s notes</w:t>
             </w:r>
           </w:p>
         </w:tc>
@@ -32987,7 +33126,7 @@
                 <w:sz w:val="20"/>
                 <w:szCs w:val="20"/>
               </w:rPr>
-              <w:t xml:space="preserve">Local model, Ollama</w:t>
+              <w:t xml:space="preserve">Ollama</w:t>
             </w:r>
           </w:p>
         </w:tc>
@@ -33021,7 +33160,7 @@
                 <w:sz w:val="20"/>
                 <w:szCs w:val="20"/>
               </w:rPr>
-              <w:t xml:space="preserve">An AI model running on Government machines, served by the Ollama software; the approved Case Assistant engine until SourceTrace is connected</w:t>
+              <w:t xml:space="preserve">The software that serves the Case Assistant’s local AI model on the ASLMS host or a Government server, used until SourceTrace is connected</w:t>
             </w:r>
           </w:p>
         </w:tc>

</xml_diff>

<commit_message>
Case Assistant polish (row 198)
Enter sends a question in the assistant box (Shift+Enter makes a new line).
Quick facts (next hearing, parties, advocates, status, last order, bench) are answered from the case record without the model, cited to Case Details.
Fewer repeated answers: the model answers only the new question, earlier turns are context only, with a repeat check.
Sources open from their reference; one-fact-one-sentence rule for model answers.
No migration. Tests: backend 2890 passed, 3 skipped; portal tests and screen-check additions.

Co-Authored-By: Claude Sonnet 5.5 <noreply@anthropic.com>
</commit_message>
<xml_diff>
--- a/docs/ASLMS_Software_Documentation.docx
+++ b/docs/ASLMS_Software_Documentation.docx
@@ -4415,6 +4415,107 @@
           </w:p>
         </w:tc>
       </w:tr>
+      <w:tr>
+        <w:trPr>
+          <w:cantSplit/>
+        </w:trPr>
+        <w:tc>
+          <w:tcPr>
+            <w:tcW w:type="dxa" w:w="1400"/>
+            <w:tcBorders>
+              <w:top w:val="single" w:color="C9D3DD" w:sz="4"/>
+              <w:left w:val="single" w:color="C9D3DD" w:sz="4"/>
+              <w:bottom w:val="single" w:color="C9D3DD" w:sz="4"/>
+              <w:right w:val="single" w:color="C9D3DD" w:sz="4"/>
+            </w:tcBorders>
+            <w:shd w:fill="EEF3F8" w:color="auto" w:val="clear"/>
+            <w:tcMar>
+              <w:top w:type="dxa" w:w="80"/>
+              <w:left w:type="dxa" w:w="120"/>
+              <w:bottom w:type="dxa" w:w="80"/>
+              <w:right w:type="dxa" w:w="120"/>
+            </w:tcMar>
+            <w:vAlign w:val="top"/>
+          </w:tcPr>
+          <w:p>
+            <w:pPr>
+              <w:spacing w:after="40"/>
+            </w:pPr>
+            <w:r>
+              <w:rPr>
+                <w:rFonts w:ascii="Calibri" w:cs="Calibri" w:eastAsia="Calibri" w:hAnsi="Calibri"/>
+                <w:sz w:val="20"/>
+                <w:szCs w:val="20"/>
+              </w:rPr>
+              <w:t xml:space="preserve">1.3</w:t>
+            </w:r>
+          </w:p>
+        </w:tc>
+        <w:tc>
+          <w:tcPr>
+            <w:tcW w:type="dxa" w:w="2200"/>
+            <w:tcBorders>
+              <w:top w:val="single" w:color="C9D3DD" w:sz="4"/>
+              <w:left w:val="single" w:color="C9D3DD" w:sz="4"/>
+              <w:bottom w:val="single" w:color="C9D3DD" w:sz="4"/>
+              <w:right w:val="single" w:color="C9D3DD" w:sz="4"/>
+            </w:tcBorders>
+            <w:shd w:fill="EEF3F8" w:color="auto" w:val="clear"/>
+            <w:tcMar>
+              <w:top w:type="dxa" w:w="80"/>
+              <w:left w:type="dxa" w:w="120"/>
+              <w:bottom w:type="dxa" w:w="80"/>
+              <w:right w:type="dxa" w:w="120"/>
+            </w:tcMar>
+            <w:vAlign w:val="top"/>
+          </w:tcPr>
+          <w:p>
+            <w:pPr>
+              <w:spacing w:after="40"/>
+            </w:pPr>
+            <w:r>
+              <w:rPr>
+                <w:rFonts w:ascii="Calibri" w:cs="Calibri" w:eastAsia="Calibri" w:hAnsi="Calibri"/>
+                <w:sz w:val="20"/>
+                <w:szCs w:val="20"/>
+              </w:rPr>
+              <w:t xml:space="preserve">28 October 2026</w:t>
+            </w:r>
+          </w:p>
+        </w:tc>
+        <w:tc>
+          <w:tcPr>
+            <w:tcW w:type="dxa" w:w="6038"/>
+            <w:tcBorders>
+              <w:top w:val="single" w:color="C9D3DD" w:sz="4"/>
+              <w:left w:val="single" w:color="C9D3DD" w:sz="4"/>
+              <w:bottom w:val="single" w:color="C9D3DD" w:sz="4"/>
+              <w:right w:val="single" w:color="C9D3DD" w:sz="4"/>
+            </w:tcBorders>
+            <w:shd w:fill="EEF3F8" w:color="auto" w:val="clear"/>
+            <w:tcMar>
+              <w:top w:type="dxa" w:w="80"/>
+              <w:left w:type="dxa" w:w="120"/>
+              <w:bottom w:type="dxa" w:w="80"/>
+              <w:right w:type="dxa" w:w="120"/>
+            </w:tcMar>
+            <w:vAlign w:val="top"/>
+          </w:tcPr>
+          <w:p>
+            <w:pPr>
+              <w:spacing w:after="40"/>
+            </w:pPr>
+            <w:r>
+              <w:rPr>
+                <w:rFonts w:ascii="Calibri" w:cs="Calibri" w:eastAsia="Calibri" w:hAnsi="Calibri"/>
+                <w:sz w:val="20"/>
+                <w:szCs w:val="20"/>
+              </w:rPr>
+              <w:t xml:space="preserve">Case Assistant polish built: Enter sends a question, six quick facts answered from the court record held for the case without the AI, sources opened from their reference, fewer repeated answers; a variation from the plan added for the quick facts.</w:t>
+            </w:r>
+          </w:p>
+        </w:tc>
+      </w:tr>
     </w:tbl>
     <w:p>
       <w:pPr>
@@ -13093,6 +13194,28 @@
     </w:p>
     <w:p>
       <w:pPr>
+        <w:spacing w:after="120" w:before="0" w:line="276"/>
+      </w:pPr>
+      <w:r>
+        <w:rPr>
+          <w:rFonts w:ascii="Calibri" w:cs="Calibri" w:eastAsia="Calibri" w:hAnsi="Calibri"/>
+        </w:rPr>
+        <w:t xml:space="preserve">Pressing Enter sends a question; Shift and Enter start a new line. Sources are not listed under an answer: each reference in the text, such as S1, opens that source in a dialog with its excerpt and a link to open it, and a Sources button opens the full list. The model is given the officer’s earlier questions in the conversation, not its own earlier answers, so that it answers the new question instead of repeating itself; a check command measures how much answers repeat.</w:t>
+      </w:r>
+    </w:p>
+    <w:p>
+      <w:pPr>
+        <w:spacing w:after="120" w:before="0" w:line="276"/>
+      </w:pPr>
+      <w:r>
+        <w:rPr>
+          <w:rFonts w:ascii="Calibri" w:cs="Calibri" w:eastAsia="Calibri" w:hAnsi="Calibri"/>
+        </w:rPr>
+        <w:t xml:space="preserve">On a case’s Assistant tab, six quick facts are answered straight from the court record held for the case, without the AI: the next hearing, the parties, the advocates, the status, the date of the last order and the bench. They are recognised only when the whole question is one of a fixed set of English forms, such as “when is the next date” or “who are the parties”; any other question goes to the AI. A quick fact is marked “From the Case Record”, cites the case details as its source, gives the same values as the case page, and is stored and audited like any answer. This is a variation from the plan (section 13.2).</w:t>
+      </w:r>
+    </w:p>
+    <w:p>
+      <w:pPr>
         <w:pStyle w:val="Heading2"/>
       </w:pPr>
       <w:r>
@@ -13599,7 +13722,7 @@
                 <w:sz w:val="20"/>
                 <w:szCs w:val="20"/>
               </w:rPr>
-              <w:t xml:space="preserve">ASLMS picks the passages; the model writes only from them and must cite them. The server checks every citation and withholds an answer without a valid source. Every source stays visible beside the answer.</w:t>
+              <w:t xml:space="preserve">ASLMS picks the passages; the model writes only from them and must cite them. The server checks every citation and withholds an answer without a valid source. Each source opens from its reference in the answer, and the full list from the answer’s Sources button.</w:t>
             </w:r>
           </w:p>
         </w:tc>
@@ -21436,6 +21559,107 @@
                 <w:sz w:val="20"/>
                 <w:szCs w:val="20"/>
               </w:rPr>
+              <w:t xml:space="preserve">Case Assistant answers by the AI</w:t>
+            </w:r>
+          </w:p>
+        </w:tc>
+        <w:tc>
+          <w:tcPr>
+            <w:tcW w:type="dxa" w:w="3638"/>
+            <w:tcBorders>
+              <w:top w:val="single" w:color="C9D3DD" w:sz="4"/>
+              <w:left w:val="single" w:color="C9D3DD" w:sz="4"/>
+              <w:bottom w:val="single" w:color="C9D3DD" w:sz="4"/>
+              <w:right w:val="single" w:color="C9D3DD" w:sz="4"/>
+            </w:tcBorders>
+            <w:shd w:fill="FFFFFF" w:color="auto" w:val="clear"/>
+            <w:tcMar>
+              <w:top w:type="dxa" w:w="80"/>
+              <w:left w:type="dxa" w:w="120"/>
+              <w:bottom w:type="dxa" w:w="80"/>
+              <w:right w:type="dxa" w:w="120"/>
+            </w:tcMar>
+            <w:vAlign w:val="top"/>
+          </w:tcPr>
+          <w:p>
+            <w:pPr>
+              <w:spacing w:after="40"/>
+            </w:pPr>
+            <w:r>
+              <w:rPr>
+                <w:rFonts w:ascii="Calibri" w:cs="Calibri" w:eastAsia="Calibri" w:hAnsi="Calibri"/>
+                <w:sz w:val="20"/>
+                <w:szCs w:val="20"/>
+              </w:rPr>
+              <w:t xml:space="preserve">Six quick facts on a case (next hearing, parties, advocates, status, last order date, bench) are answered from the court record held for the case, without the AI, with the same reference</w:t>
+            </w:r>
+          </w:p>
+        </w:tc>
+        <w:tc>
+          <w:tcPr>
+            <w:tcW w:type="dxa" w:w="3200"/>
+            <w:tcBorders>
+              <w:top w:val="single" w:color="C9D3DD" w:sz="4"/>
+              <w:left w:val="single" w:color="C9D3DD" w:sz="4"/>
+              <w:bottom w:val="single" w:color="C9D3DD" w:sz="4"/>
+              <w:right w:val="single" w:color="C9D3DD" w:sz="4"/>
+            </w:tcBorders>
+            <w:shd w:fill="FFFFFF" w:color="auto" w:val="clear"/>
+            <w:tcMar>
+              <w:top w:type="dxa" w:w="80"/>
+              <w:left w:type="dxa" w:w="120"/>
+              <w:bottom w:type="dxa" w:w="80"/>
+              <w:right w:type="dxa" w:w="120"/>
+            </w:tcMar>
+            <w:vAlign w:val="top"/>
+          </w:tcPr>
+          <w:p>
+            <w:pPr>
+              <w:spacing w:after="40"/>
+            </w:pPr>
+            <w:r>
+              <w:rPr>
+                <w:rFonts w:ascii="Calibri" w:cs="Calibri" w:eastAsia="Calibri" w:hAnsi="Calibri"/>
+                <w:sz w:val="20"/>
+                <w:szCs w:val="20"/>
+              </w:rPr>
+              <w:t xml:space="preserve">Owner, 28 Oct 2026: crisp answers to specific questions</w:t>
+            </w:r>
+          </w:p>
+        </w:tc>
+      </w:tr>
+      <w:tr>
+        <w:trPr>
+          <w:cantSplit/>
+        </w:trPr>
+        <w:tc>
+          <w:tcPr>
+            <w:tcW w:type="dxa" w:w="2800"/>
+            <w:tcBorders>
+              <w:top w:val="single" w:color="C9D3DD" w:sz="4"/>
+              <w:left w:val="single" w:color="C9D3DD" w:sz="4"/>
+              <w:bottom w:val="single" w:color="C9D3DD" w:sz="4"/>
+              <w:right w:val="single" w:color="C9D3DD" w:sz="4"/>
+            </w:tcBorders>
+            <w:shd w:fill="EEF3F8" w:color="auto" w:val="clear"/>
+            <w:tcMar>
+              <w:top w:type="dxa" w:w="80"/>
+              <w:left w:type="dxa" w:w="120"/>
+              <w:bottom w:type="dxa" w:w="80"/>
+              <w:right w:type="dxa" w:w="120"/>
+            </w:tcMar>
+            <w:vAlign w:val="top"/>
+          </w:tcPr>
+          <w:p>
+            <w:pPr>
+              <w:spacing w:after="40"/>
+            </w:pPr>
+            <w:r>
+              <w:rPr>
+                <w:rFonts w:ascii="Calibri" w:cs="Calibri" w:eastAsia="Calibri" w:hAnsi="Calibri"/>
+                <w:sz w:val="20"/>
+                <w:szCs w:val="20"/>
+              </w:rPr>
               <w:t xml:space="preserve">Notes and internal documents never sent to the AI</w:t>
             </w:r>
           </w:p>
@@ -21449,7 +21673,7 @@
               <w:bottom w:val="single" w:color="C9D3DD" w:sz="4"/>
               <w:right w:val="single" w:color="C9D3DD" w:sz="4"/>
             </w:tcBorders>
-            <w:shd w:fill="FFFFFF" w:color="auto" w:val="clear"/>
+            <w:shd w:fill="EEF3F8" w:color="auto" w:val="clear"/>
             <w:tcMar>
               <w:top w:type="dxa" w:w="80"/>
               <w:left w:type="dxa" w:w="120"/>
@@ -21481,7 +21705,7 @@
               <w:bottom w:val="single" w:color="C9D3DD" w:sz="4"/>
               <w:right w:val="single" w:color="C9D3DD" w:sz="4"/>
             </w:tcBorders>
-            <w:shd w:fill="FFFFFF" w:color="auto" w:val="clear"/>
+            <w:shd w:fill="EEF3F8" w:color="auto" w:val="clear"/>
             <w:tcMar>
               <w:top w:type="dxa" w:w="80"/>
               <w:left w:type="dxa" w:w="120"/>
@@ -22120,7 +22344,7 @@
                 <w:sz w:val="20"/>
                 <w:szCs w:val="20"/>
               </w:rPr>
-              <w:t xml:space="preserve">Enter sends a question; short answers for facts such as the next date and the parties; the sources of an answer shown in a dialog when a reference is clicked (approved; planned, not built)</w:t>
+              <w:t xml:space="preserve">Enter sends a question; six quick facts such as the next date and the parties answered from the court record; the sources of an answer shown in a dialog when a reference is clicked; fewer repeated answers (built; awaiting deployment)</w:t>
             </w:r>
           </w:p>
         </w:tc>

</xml_diff>

<commit_message>
Next hearing shown directly from the latest court order (row 199)
- One next hearing per case, computed in services/next_hearing.py and stored on cases by refresh (court record, else latest order reading, else Date Passed, else entry by hand).
- Order readings are shown without confirmation (periods as "around"); the review queue is enter-only; a court/order difference is flagged (Order Differs).
- Report Wrong Next Date, Reading Is Right and correct (next_dates.report_wrong, next_dates.correct); calendar and hearing alerts follow the order readings.
- Migration 0034 (six derived columns on cases, event type, functions); aslms next-dates direct and hearing-refresh.
- Portal: HearingDate badge basis lines, Next Dates to Enter, case page block, dashboard count.
- Tests: 2944 passed, 3 skipped; ruff clean; portal smoke passed.

Co-Authored-By: Claude Sonnet 5.5 <noreply@anthropic.com>
</commit_message>
<xml_diff>
--- a/docs/ASLMS_Software_Documentation.docx
+++ b/docs/ASLMS_Software_Documentation.docx
@@ -4516,6 +4516,107 @@
           </w:p>
         </w:tc>
       </w:tr>
+      <w:tr>
+        <w:trPr>
+          <w:cantSplit/>
+        </w:trPr>
+        <w:tc>
+          <w:tcPr>
+            <w:tcW w:type="dxa" w:w="1400"/>
+            <w:tcBorders>
+              <w:top w:val="single" w:color="C9D3DD" w:sz="4"/>
+              <w:left w:val="single" w:color="C9D3DD" w:sz="4"/>
+              <w:bottom w:val="single" w:color="C9D3DD" w:sz="4"/>
+              <w:right w:val="single" w:color="C9D3DD" w:sz="4"/>
+            </w:tcBorders>
+            <w:shd w:fill="FFFFFF" w:color="auto" w:val="clear"/>
+            <w:tcMar>
+              <w:top w:type="dxa" w:w="80"/>
+              <w:left w:type="dxa" w:w="120"/>
+              <w:bottom w:type="dxa" w:w="80"/>
+              <w:right w:type="dxa" w:w="120"/>
+            </w:tcMar>
+            <w:vAlign w:val="top"/>
+          </w:tcPr>
+          <w:p>
+            <w:pPr>
+              <w:spacing w:after="40"/>
+            </w:pPr>
+            <w:r>
+              <w:rPr>
+                <w:rFonts w:ascii="Calibri" w:cs="Calibri" w:eastAsia="Calibri" w:hAnsi="Calibri"/>
+                <w:sz w:val="20"/>
+                <w:szCs w:val="20"/>
+              </w:rPr>
+              <w:t xml:space="preserve">1.4</w:t>
+            </w:r>
+          </w:p>
+        </w:tc>
+        <w:tc>
+          <w:tcPr>
+            <w:tcW w:type="dxa" w:w="2200"/>
+            <w:tcBorders>
+              <w:top w:val="single" w:color="C9D3DD" w:sz="4"/>
+              <w:left w:val="single" w:color="C9D3DD" w:sz="4"/>
+              <w:bottom w:val="single" w:color="C9D3DD" w:sz="4"/>
+              <w:right w:val="single" w:color="C9D3DD" w:sz="4"/>
+            </w:tcBorders>
+            <w:shd w:fill="FFFFFF" w:color="auto" w:val="clear"/>
+            <w:tcMar>
+              <w:top w:type="dxa" w:w="80"/>
+              <w:left w:type="dxa" w:w="120"/>
+              <w:bottom w:type="dxa" w:w="80"/>
+              <w:right w:type="dxa" w:w="120"/>
+            </w:tcMar>
+            <w:vAlign w:val="top"/>
+          </w:tcPr>
+          <w:p>
+            <w:pPr>
+              <w:spacing w:after="40"/>
+            </w:pPr>
+            <w:r>
+              <w:rPr>
+                <w:rFonts w:ascii="Calibri" w:cs="Calibri" w:eastAsia="Calibri" w:hAnsi="Calibri"/>
+                <w:sz w:val="20"/>
+                <w:szCs w:val="20"/>
+              </w:rPr>
+              <w:t xml:space="preserve">28 October 2026</w:t>
+            </w:r>
+          </w:p>
+        </w:tc>
+        <w:tc>
+          <w:tcPr>
+            <w:tcW w:type="dxa" w:w="6038"/>
+            <w:tcBorders>
+              <w:top w:val="single" w:color="C9D3DD" w:sz="4"/>
+              <w:left w:val="single" w:color="C9D3DD" w:sz="4"/>
+              <w:bottom w:val="single" w:color="C9D3DD" w:sz="4"/>
+              <w:right w:val="single" w:color="C9D3DD" w:sz="4"/>
+            </w:tcBorders>
+            <w:shd w:fill="FFFFFF" w:color="auto" w:val="clear"/>
+            <w:tcMar>
+              <w:top w:type="dxa" w:w="80"/>
+              <w:left w:type="dxa" w:w="120"/>
+              <w:bottom w:type="dxa" w:w="80"/>
+              <w:right w:type="dxa" w:w="120"/>
+            </w:tcMar>
+            <w:vAlign w:val="top"/>
+          </w:tcPr>
+          <w:p>
+            <w:pPr>
+              <w:spacing w:after="40"/>
+            </w:pPr>
+            <w:r>
+              <w:rPr>
+                <w:rFonts w:ascii="Calibri" w:cs="Calibri" w:eastAsia="Calibri" w:hAnsi="Calibri"/>
+                <w:sz w:val="20"/>
+                <w:szCs w:val="20"/>
+              </w:rPr>
+              <w:t xml:space="preserve">Next hearing shown directly from the latest court order: one next hearing per case, court-given dates not editable, approximate dates for periods, a flag where the order and the court differ, and functions to report and correct a misread order.</w:t>
+            </w:r>
+          </w:p>
+        </w:tc>
+      </w:tr>
     </w:tbl>
     <w:p>
       <w:pPr>
@@ -10514,7 +10615,7 @@
         <w:rPr>
           <w:rFonts w:ascii="Calibri" w:cs="Calibri" w:eastAsia="Calibri" w:hAnsi="Calibri"/>
         </w:rPr>
-        <w:t xml:space="preserve">Hearing dates come from the court’s own next date, from cause-list listings, and from dates read in order text. A date read from an order is firm only when it equals the court’s own date or a listing; otherwise it is a suggestion that an officer confirms, rejects (with a replacement date) or enters by hand. Directions such as “list after four weeks” are counted from the order date and always shown for confirmation.</w:t>
+        <w:t xml:space="preserve">Hearing dates come from the court’s own next date, from cause-list listings, and from dates read in order text. Each case has one next hearing, worked out by the server: the court’s own record first, otherwise the date read from the latest order, shown directly with no confirmation. A written date is shown exact; a period such as “list after four weeks”, a qualified date or a returnable date is shown as an approximate date counted from the order, with its words, until the court’s own date replaces it. When the court’s date and an exact date read from the latest order differ, the court’s date is shown and the difference is flagged. Nobody can edit a date the court has given; only where the court gave none does an officer enter a date by hand. An officer can report a date read wrongly from an order, and the Super Administrator (by default) corrects it; both steps are audited.</w:t>
       </w:r>
     </w:p>
     <w:tbl>
@@ -11193,7 +11294,7 @@
                 <w:sz w:val="20"/>
                 <w:szCs w:val="20"/>
               </w:rPr>
-              <w:t xml:space="preserve">A next date to confirm</w:t>
+              <w:t xml:space="preserve">A next date to enter (the court gave none)</w:t>
             </w:r>
           </w:p>
         </w:tc>
@@ -11226,6 +11327,75 @@
                 <w:szCs w:val="20"/>
               </w:rPr>
               <w:t xml:space="preserve">To the officers working on the case</w:t>
+            </w:r>
+          </w:p>
+        </w:tc>
+      </w:tr>
+      <w:tr>
+        <w:trPr>
+          <w:cantSplit/>
+        </w:trPr>
+        <w:tc>
+          <w:tcPr>
+            <w:tcW w:type="dxa" w:w="5000"/>
+            <w:tcBorders>
+              <w:top w:val="single" w:color="C9D3DD" w:sz="4"/>
+              <w:left w:val="single" w:color="C9D3DD" w:sz="4"/>
+              <w:bottom w:val="single" w:color="C9D3DD" w:sz="4"/>
+              <w:right w:val="single" w:color="C9D3DD" w:sz="4"/>
+            </w:tcBorders>
+            <w:shd w:fill="EEF3F8" w:color="auto" w:val="clear"/>
+            <w:tcMar>
+              <w:top w:type="dxa" w:w="80"/>
+              <w:left w:type="dxa" w:w="120"/>
+              <w:bottom w:type="dxa" w:w="80"/>
+              <w:right w:type="dxa" w:w="120"/>
+            </w:tcMar>
+            <w:vAlign w:val="top"/>
+          </w:tcPr>
+          <w:p>
+            <w:pPr>
+              <w:spacing w:after="40"/>
+            </w:pPr>
+            <w:r>
+              <w:rPr>
+                <w:rFonts w:ascii="Calibri" w:cs="Calibri" w:eastAsia="Calibri" w:hAnsi="Calibri"/>
+                <w:sz w:val="20"/>
+                <w:szCs w:val="20"/>
+              </w:rPr>
+              <w:t xml:space="preserve">A next date reported as wrong</w:t>
+            </w:r>
+          </w:p>
+        </w:tc>
+        <w:tc>
+          <w:tcPr>
+            <w:tcW w:type="dxa" w:w="4638"/>
+            <w:tcBorders>
+              <w:top w:val="single" w:color="C9D3DD" w:sz="4"/>
+              <w:left w:val="single" w:color="C9D3DD" w:sz="4"/>
+              <w:bottom w:val="single" w:color="C9D3DD" w:sz="4"/>
+              <w:right w:val="single" w:color="C9D3DD" w:sz="4"/>
+            </w:tcBorders>
+            <w:shd w:fill="EEF3F8" w:color="auto" w:val="clear"/>
+            <w:tcMar>
+              <w:top w:type="dxa" w:w="80"/>
+              <w:left w:type="dxa" w:w="120"/>
+              <w:bottom w:type="dxa" w:w="80"/>
+              <w:right w:type="dxa" w:w="120"/>
+            </w:tcMar>
+            <w:vAlign w:val="top"/>
+          </w:tcPr>
+          <w:p>
+            <w:pPr>
+              <w:spacing w:after="40"/>
+            </w:pPr>
+            <w:r>
+              <w:rPr>
+                <w:rFonts w:ascii="Calibri" w:cs="Calibri" w:eastAsia="Calibri" w:hAnsi="Calibri"/>
+                <w:sz w:val="20"/>
+                <w:szCs w:val="20"/>
+              </w:rPr>
+              <w:t xml:space="preserve">To the holders of Correct Misread Next Date</w:t>
             </w:r>
           </w:p>
         </w:tc>
@@ -11258,7 +11428,7 @@
         <w:rPr>
           <w:rFonts w:ascii="Calibri" w:cs="Calibri" w:eastAsia="Calibri" w:hAnsi="Calibri"/>
         </w:rPr>
-        <w:t xml:space="preserve"> shows a person’s hearings, due dates and dates to confirm; </w:t>
+        <w:t xml:space="preserve"> shows a person’s hearings and due dates, including dates read from orders; </w:t>
       </w:r>
       <w:r>
         <w:rPr>
@@ -11283,7 +11453,7 @@
         <w:rPr>
           <w:rFonts w:ascii="Calibri" w:cs="Calibri" w:eastAsia="Calibri" w:hAnsi="Calibri"/>
         </w:rPr>
-        <w:t xml:space="preserve">The next hearing is shown with one badge on the case page, the case lists and the dashboards: Today and Tomorrow in strong red, two to seven days in amber with the number of days, later dates as the date, and Date Passed, No Date Yet or Disposed in words. A date suggested from an order is outlined and labelled Suggested. The meaning is always given in words, never by colour alone.</w:t>
+        <w:t xml:space="preserve">The next hearing is shown with one badge on the case page, the case lists and the dashboards: Today and Tomorrow in strong red, two to seven days in amber with the number of days, later dates as the date, and Date Passed, No Date Yet or Disposed in words. A date counted from an order is labelled Around. The meaning is always given in words, never by colour alone.</w:t>
       </w:r>
     </w:p>
     <w:p>
@@ -20985,7 +21155,7 @@
                 <w:sz w:val="20"/>
                 <w:szCs w:val="20"/>
               </w:rPr>
-              <w:t xml:space="preserve">Read by fixed rules and confirmed by a person; SourceTrace to assist when connected</w:t>
+              <w:t xml:space="preserve">Read by fixed rules and shown directly; a person enters a date only where the court gave none; SourceTrace to assist when connected</w:t>
             </w:r>
           </w:p>
         </w:tc>
@@ -22417,7 +22587,7 @@
                 <w:sz w:val="20"/>
                 <w:szCs w:val="20"/>
               </w:rPr>
-              <w:t xml:space="preserve">The next hearing shown directly from the latest court order: dates given by the court shown without confirmation and not editable by anyone; a Report Wrong Next Date function; periods such as “list after three weeks” shown as an approximate date counted from the order (approved; planned, not built)</w:t>
+              <w:t xml:space="preserve">The next hearing shown directly from the latest court order: dates given by the court shown without confirmation and not editable by anyone; a Report Wrong Next Date function and a Correct Misread Next Date function; periods such as “list after three weeks” shown as an approximate date counted from the order (built; awaiting deployment)</w:t>
             </w:r>
           </w:p>
         </w:tc>

</xml_diff>